<commit_message>
Finished quality and error audit analysis
</commit_message>
<xml_diff>
--- a/ANALYSIS LOG.docx
+++ b/ANALYSIS LOG.docx
@@ -451,13 +451,7 @@
         <w:rPr>
           <w:lang w:val="en-GB"/>
         </w:rPr>
-        <w:t xml:space="preserve"> &gt; 1 min</w:t>
-      </w:r>
-      <w:r>
-        <w:rPr>
-          <w:lang w:val="en-GB"/>
-        </w:rPr>
-        <w:t xml:space="preserve">, which would imply that a ride hadn’t taken </w:t>
+        <w:t xml:space="preserve"> &gt; 1 min, which would imply that a ride hadn’t taken </w:t>
       </w:r>
       <w:proofErr w:type="gramStart"/>
       <w:r>
@@ -471,13 +465,7 @@
         <w:rPr>
           <w:lang w:val="en-GB"/>
         </w:rPr>
-        <w:t xml:space="preserve"> to</w:t>
-      </w:r>
-      <w:r>
-        <w:rPr>
-          <w:lang w:val="en-GB"/>
-        </w:rPr>
-        <w:t xml:space="preserve"> check if there was significant data within that range (Did not remove as it was not only significant but could offer insights and help improve the unlocking process )</w:t>
+        <w:t xml:space="preserve"> to check if there was significant data within that range (Did not remove as it was not only significant but could offer insights and help improve the unlocking process )</w:t>
       </w:r>
     </w:p>
     <w:p>
@@ -949,6 +937,24 @@
           <w:lang w:val="en-GB"/>
         </w:rPr>
         <w:t>bikes with less than 1 min rides indicating unlocking error or system error</w:t>
+      </w:r>
+    </w:p>
+    <w:p>
+      <w:pPr>
+        <w:pStyle w:val="ListParagraph"/>
+        <w:numPr>
+          <w:ilvl w:val="0"/>
+          <w:numId w:val="3"/>
+        </w:numPr>
+        <w:rPr>
+          <w:lang w:val="en-GB"/>
+        </w:rPr>
+      </w:pPr>
+      <w:r>
+        <w:rPr>
+          <w:lang w:val="en-001"/>
+        </w:rPr>
+        <w:t>calculate mean, max, std for bike ride length for non error data</w:t>
       </w:r>
     </w:p>
     <w:p>

</xml_diff>

<commit_message>
corrected wording mistakes and rewrote analysis questions
</commit_message>
<xml_diff>
--- a/ANALYSIS LOG.docx
+++ b/ANALYSIS LOG.docx
@@ -19,27 +19,7 @@
           <w:u w:val="single"/>
           <w:lang w:val="en-GB"/>
         </w:rPr>
-        <w:t>ANALYSIS LOG (</w:t>
-      </w:r>
-      <w:proofErr w:type="spellStart"/>
-      <w:r>
-        <w:rPr>
-          <w:b/>
-          <w:bCs/>
-          <w:u w:val="single"/>
-          <w:lang w:val="en-GB"/>
-        </w:rPr>
-        <w:t>Cyclistic</w:t>
-      </w:r>
-      <w:proofErr w:type="spellEnd"/>
-      <w:r>
-        <w:rPr>
-          <w:b/>
-          <w:bCs/>
-          <w:u w:val="single"/>
-          <w:lang w:val="en-GB"/>
-        </w:rPr>
-        <w:t xml:space="preserve"> Bike Share analysis)</w:t>
+        <w:t>ANALYSIS LOG (Cyclistic Bike Share analysis)</w:t>
       </w:r>
     </w:p>
     <w:p>
@@ -68,54 +48,26 @@
         <w:rPr>
           <w:lang w:val="en-GB"/>
         </w:rPr>
-        <w:t xml:space="preserve">Prepare and </w:t>
-      </w:r>
-      <w:proofErr w:type="gramStart"/>
-      <w:r>
-        <w:rPr>
-          <w:lang w:val="en-GB"/>
-        </w:rPr>
-        <w:t xml:space="preserve">Process </w:t>
-      </w:r>
-      <w:r>
-        <w:rPr>
-          <w:lang w:val="en-GB"/>
-        </w:rPr>
-        <w:t xml:space="preserve"> via</w:t>
-      </w:r>
-      <w:proofErr w:type="gramEnd"/>
-      <w:r>
-        <w:rPr>
-          <w:lang w:val="en-GB"/>
-        </w:rPr>
-        <w:t xml:space="preserve"> Excel Power Query</w:t>
-      </w:r>
-    </w:p>
-    <w:p>
-      <w:pPr>
-        <w:rPr>
-          <w:lang w:val="en-GB"/>
-        </w:rPr>
-      </w:pPr>
-      <w:r>
-        <w:rPr>
-          <w:lang w:val="en-GB"/>
-        </w:rPr>
-        <w:t xml:space="preserve">  Using Excel power query for initial </w:t>
-      </w:r>
-      <w:proofErr w:type="gramStart"/>
-      <w:r>
-        <w:rPr>
-          <w:lang w:val="en-GB"/>
-        </w:rPr>
-        <w:t>ETL ,</w:t>
-      </w:r>
-      <w:proofErr w:type="gramEnd"/>
-      <w:r>
-        <w:rPr>
-          <w:lang w:val="en-GB"/>
-        </w:rPr>
-        <w:t xml:space="preserve"> Extract, Transform and Load, to handle the messy files</w:t>
+        <w:t xml:space="preserve">Prepare and Process </w:t>
+      </w:r>
+      <w:r>
+        <w:rPr>
+          <w:lang w:val="en-GB"/>
+        </w:rPr>
+        <w:t xml:space="preserve"> via Excel Power Query</w:t>
+      </w:r>
+    </w:p>
+    <w:p>
+      <w:pPr>
+        <w:rPr>
+          <w:lang w:val="en-GB"/>
+        </w:rPr>
+      </w:pPr>
+      <w:r>
+        <w:rPr>
+          <w:lang w:val="en-GB"/>
+        </w:rPr>
+        <w:t xml:space="preserve">  Using Excel power query for initial ETL , Extract, Transform and Load, to handle the messy files</w:t>
       </w:r>
     </w:p>
     <w:p>
@@ -199,193 +151,91 @@
         <w:rPr>
           <w:lang w:val="en-GB"/>
         </w:rPr>
-        <w:t xml:space="preserve">and then later filtered according to month to save them </w:t>
-      </w:r>
-      <w:proofErr w:type="gramStart"/>
-      <w:r>
-        <w:rPr>
-          <w:lang w:val="en-GB"/>
-        </w:rPr>
-        <w:t>separately</w:t>
-      </w:r>
-      <w:r>
-        <w:rPr>
-          <w:lang w:val="en-GB"/>
-        </w:rPr>
-        <w:t>[</w:t>
-      </w:r>
-      <w:proofErr w:type="gramEnd"/>
-      <w:r>
-        <w:rPr>
-          <w:lang w:val="en-GB"/>
-        </w:rPr>
-        <w:t>Don’t do this]</w:t>
-      </w:r>
-    </w:p>
-    <w:p>
-      <w:pPr>
-        <w:pStyle w:val="ListParagraph"/>
-        <w:numPr>
-          <w:ilvl w:val="0"/>
-          <w:numId w:val="3"/>
-        </w:numPr>
-        <w:rPr>
-          <w:lang w:val="en-GB"/>
-        </w:rPr>
-      </w:pPr>
-      <w:r>
-        <w:rPr>
-          <w:lang w:val="en-GB"/>
-        </w:rPr>
-        <w:t xml:space="preserve">Opening the </w:t>
-      </w:r>
-      <w:proofErr w:type="spellStart"/>
-      <w:r>
-        <w:rPr>
-          <w:lang w:val="en-GB"/>
-        </w:rPr>
-        <w:t>csvs</w:t>
-      </w:r>
-      <w:proofErr w:type="spellEnd"/>
-      <w:r>
-        <w:rPr>
-          <w:lang w:val="en-GB"/>
-        </w:rPr>
-        <w:t>/workbooks in power query for data cleaning, sorting and formatting</w:t>
-      </w:r>
-    </w:p>
-    <w:p>
-      <w:pPr>
-        <w:pStyle w:val="ListParagraph"/>
-        <w:numPr>
-          <w:ilvl w:val="0"/>
-          <w:numId w:val="3"/>
-        </w:numPr>
-        <w:rPr>
-          <w:lang w:val="en-GB"/>
-        </w:rPr>
-      </w:pPr>
-      <w:r>
-        <w:rPr>
-          <w:lang w:val="en-GB"/>
-        </w:rPr>
-        <w:t xml:space="preserve">Data </w:t>
-      </w:r>
-      <w:proofErr w:type="gramStart"/>
-      <w:r>
-        <w:rPr>
-          <w:lang w:val="en-GB"/>
-        </w:rPr>
-        <w:t>cleaning(</w:t>
-      </w:r>
-      <w:proofErr w:type="gramEnd"/>
-      <w:r>
-        <w:rPr>
-          <w:lang w:val="en-GB"/>
-        </w:rPr>
-        <w:t>changing format to the dd/mm/</w:t>
-      </w:r>
-      <w:proofErr w:type="spellStart"/>
-      <w:r>
-        <w:rPr>
-          <w:lang w:val="en-GB"/>
-        </w:rPr>
-        <w:t>yyyy</w:t>
-      </w:r>
-      <w:proofErr w:type="spellEnd"/>
-      <w:r>
-        <w:rPr>
-          <w:lang w:val="en-GB"/>
-        </w:rPr>
-        <w:t xml:space="preserve"> </w:t>
-      </w:r>
-      <w:proofErr w:type="spellStart"/>
-      <w:r>
-        <w:rPr>
-          <w:lang w:val="en-GB"/>
-        </w:rPr>
-        <w:t>hh:mm</w:t>
-      </w:r>
-      <w:proofErr w:type="spellEnd"/>
-      <w:r>
-        <w:rPr>
-          <w:lang w:val="en-GB"/>
-        </w:rPr>
-        <w:t xml:space="preserve"> format for the </w:t>
-      </w:r>
-      <w:proofErr w:type="spellStart"/>
-      <w:r>
-        <w:rPr>
-          <w:lang w:val="en-GB"/>
-        </w:rPr>
-        <w:t>started_at</w:t>
-      </w:r>
-      <w:proofErr w:type="spellEnd"/>
-      <w:r>
-        <w:rPr>
-          <w:lang w:val="en-GB"/>
-        </w:rPr>
-        <w:t xml:space="preserve"> and </w:t>
-      </w:r>
-      <w:proofErr w:type="spellStart"/>
-      <w:r>
-        <w:rPr>
-          <w:lang w:val="en-GB"/>
-        </w:rPr>
-        <w:t>ended_at</w:t>
-      </w:r>
-      <w:proofErr w:type="spellEnd"/>
-      <w:r>
-        <w:rPr>
-          <w:lang w:val="en-GB"/>
-        </w:rPr>
-        <w:t xml:space="preserve"> time columns </w:t>
-      </w:r>
-    </w:p>
-    <w:p>
-      <w:pPr>
-        <w:pStyle w:val="ListParagraph"/>
-        <w:numPr>
-          <w:ilvl w:val="0"/>
-          <w:numId w:val="3"/>
-        </w:numPr>
-        <w:rPr>
-          <w:lang w:val="en-GB"/>
-        </w:rPr>
-      </w:pPr>
-      <w:r>
-        <w:rPr>
-          <w:lang w:val="en-GB"/>
-        </w:rPr>
-        <w:t xml:space="preserve">Creating new columns for </w:t>
-      </w:r>
-      <w:proofErr w:type="spellStart"/>
-      <w:r>
-        <w:rPr>
-          <w:lang w:val="en-GB"/>
-        </w:rPr>
-        <w:t>ride_length</w:t>
-      </w:r>
-      <w:proofErr w:type="spellEnd"/>
-      <w:r>
-        <w:rPr>
-          <w:lang w:val="en-GB"/>
-        </w:rPr>
-        <w:t xml:space="preserve"> (end time </w:t>
-      </w:r>
-      <w:proofErr w:type="gramStart"/>
-      <w:r>
-        <w:rPr>
-          <w:lang w:val="en-GB"/>
-        </w:rPr>
-        <w:t>-  start</w:t>
-      </w:r>
-      <w:proofErr w:type="gramEnd"/>
-      <w:r>
-        <w:rPr>
-          <w:lang w:val="en-GB"/>
-        </w:rPr>
-        <w:t xml:space="preserve"> time) </w:t>
+        <w:t>and then later filtered according to month to save them separately</w:t>
+      </w:r>
+      <w:r>
+        <w:rPr>
+          <w:lang w:val="en-GB"/>
+        </w:rPr>
+        <w:t>[Don’t do this]</w:t>
+      </w:r>
+    </w:p>
+    <w:p>
+      <w:pPr>
+        <w:pStyle w:val="ListParagraph"/>
+        <w:numPr>
+          <w:ilvl w:val="0"/>
+          <w:numId w:val="3"/>
+        </w:numPr>
+        <w:rPr>
+          <w:lang w:val="en-GB"/>
+        </w:rPr>
+      </w:pPr>
+      <w:r>
+        <w:rPr>
+          <w:lang w:val="en-GB"/>
+        </w:rPr>
+        <w:t>Open the csvs/workbooks in power query for data cleaning, sorting and formatting</w:t>
+      </w:r>
+    </w:p>
+    <w:p>
+      <w:pPr>
+        <w:pStyle w:val="ListParagraph"/>
+        <w:numPr>
+          <w:ilvl w:val="0"/>
+          <w:numId w:val="3"/>
+        </w:numPr>
+        <w:rPr>
+          <w:lang w:val="en-GB"/>
+        </w:rPr>
+      </w:pPr>
+      <w:r>
+        <w:rPr>
+          <w:lang w:val="en-GB"/>
+        </w:rPr>
+        <w:t>Performed d</w:t>
+      </w:r>
+      <w:r>
+        <w:rPr>
+          <w:lang w:val="en-GB"/>
+        </w:rPr>
+        <w:t xml:space="preserve">ata cleaning(changing format to the dd/mm/yyyy hh:mm format for the started_at and ended_at time columns </w:t>
+      </w:r>
+    </w:p>
+    <w:p>
+      <w:pPr>
+        <w:pStyle w:val="ListParagraph"/>
+        <w:numPr>
+          <w:ilvl w:val="0"/>
+          <w:numId w:val="3"/>
+        </w:numPr>
+        <w:rPr>
+          <w:lang w:val="en-GB"/>
+        </w:rPr>
+      </w:pPr>
+      <w:r>
+        <w:rPr>
+          <w:lang w:val="en-GB"/>
+        </w:rPr>
+        <w:t>Creat</w:t>
+      </w:r>
+      <w:r>
+        <w:rPr>
+          <w:lang w:val="en-GB"/>
+        </w:rPr>
+        <w:t>ed</w:t>
+      </w:r>
+      <w:r>
+        <w:rPr>
+          <w:lang w:val="en-GB"/>
+        </w:rPr>
+        <w:t xml:space="preserve"> new columns for </w:t>
+      </w:r>
+      <w:r>
+        <w:rPr>
+          <w:lang w:val="en-GB"/>
+        </w:rPr>
+        <w:t xml:space="preserve">ride_length (end time -  start time) </w:t>
       </w:r>
       <w:r>
         <w:rPr>
@@ -397,75 +247,25 @@
         <w:rPr>
           <w:lang w:val="en-GB"/>
         </w:rPr>
-        <w:t xml:space="preserve">and also </w:t>
-      </w:r>
-      <w:proofErr w:type="spellStart"/>
-      <w:r>
-        <w:rPr>
-          <w:lang w:val="en-GB"/>
-        </w:rPr>
-        <w:t>day_of_week</w:t>
-      </w:r>
-      <w:proofErr w:type="spellEnd"/>
-    </w:p>
-    <w:p>
-      <w:pPr>
-        <w:pStyle w:val="ListParagraph"/>
-        <w:numPr>
-          <w:ilvl w:val="0"/>
-          <w:numId w:val="3"/>
-        </w:numPr>
-        <w:rPr>
-          <w:lang w:val="en-GB"/>
-        </w:rPr>
-      </w:pPr>
-      <w:r>
-        <w:rPr>
-          <w:lang w:val="en-GB"/>
-        </w:rPr>
-        <w:t xml:space="preserve">Filtered the </w:t>
-      </w:r>
-      <w:proofErr w:type="spellStart"/>
-      <w:r>
-        <w:rPr>
-          <w:lang w:val="en-GB"/>
-        </w:rPr>
-        <w:t>ride_length</w:t>
-      </w:r>
-      <w:proofErr w:type="spellEnd"/>
-      <w:r>
-        <w:rPr>
-          <w:lang w:val="en-GB"/>
-        </w:rPr>
-        <w:t xml:space="preserve"> column to only include data where </w:t>
-      </w:r>
-      <w:proofErr w:type="spellStart"/>
-      <w:r>
-        <w:rPr>
-          <w:lang w:val="en-GB"/>
-        </w:rPr>
-        <w:t>ride_length</w:t>
-      </w:r>
-      <w:proofErr w:type="spellEnd"/>
-      <w:r>
-        <w:rPr>
-          <w:lang w:val="en-GB"/>
-        </w:rPr>
-        <w:t xml:space="preserve"> &gt; 1 min, which would imply that a ride hadn’t taken </w:t>
-      </w:r>
-      <w:proofErr w:type="gramStart"/>
-      <w:r>
-        <w:rPr>
-          <w:lang w:val="en-GB"/>
-        </w:rPr>
-        <w:t>place ,</w:t>
-      </w:r>
-      <w:proofErr w:type="gramEnd"/>
-      <w:r>
-        <w:rPr>
-          <w:lang w:val="en-GB"/>
-        </w:rPr>
-        <w:t xml:space="preserve"> to check if there was significant data within that range (Did not remove as it was not only significant but could offer insights and help improve the unlocking process )</w:t>
+        <w:t>and also day_of_week</w:t>
+      </w:r>
+    </w:p>
+    <w:p>
+      <w:pPr>
+        <w:pStyle w:val="ListParagraph"/>
+        <w:numPr>
+          <w:ilvl w:val="0"/>
+          <w:numId w:val="3"/>
+        </w:numPr>
+        <w:rPr>
+          <w:lang w:val="en-GB"/>
+        </w:rPr>
+      </w:pPr>
+      <w:r>
+        <w:rPr>
+          <w:lang w:val="en-GB"/>
+        </w:rPr>
+        <w:t>Filtered the ride_length column to only include data where ride_length &gt; 1 min, which would imply that a ride hadn’t taken place , to check if there was significant data within that range (Did not remove as it was not only significant but could offer insights and help improve the unlocking process )</w:t>
       </w:r>
     </w:p>
     <w:p>
@@ -501,49 +301,7 @@
         <w:rPr>
           <w:lang w:val="en-GB"/>
         </w:rPr>
-        <w:t xml:space="preserve">Created a separate column that considers the </w:t>
-      </w:r>
-      <w:proofErr w:type="spellStart"/>
-      <w:r>
-        <w:rPr>
-          <w:lang w:val="en-GB"/>
-        </w:rPr>
-        <w:t>ride_length</w:t>
-      </w:r>
-      <w:proofErr w:type="spellEnd"/>
-      <w:r>
-        <w:rPr>
-          <w:lang w:val="en-GB"/>
-        </w:rPr>
-        <w:t xml:space="preserve"> and separates those that are timed out by the system </w:t>
-      </w:r>
-      <w:proofErr w:type="gramStart"/>
-      <w:r>
-        <w:rPr>
-          <w:lang w:val="en-GB"/>
-        </w:rPr>
-        <w:t xml:space="preserve">( </w:t>
-      </w:r>
-      <w:proofErr w:type="spellStart"/>
-      <w:r>
-        <w:rPr>
-          <w:lang w:val="en-GB"/>
-        </w:rPr>
-        <w:t>ride</w:t>
-      </w:r>
-      <w:proofErr w:type="gramEnd"/>
-      <w:r>
-        <w:rPr>
-          <w:lang w:val="en-GB"/>
-        </w:rPr>
-        <w:t>_length</w:t>
-      </w:r>
-      <w:proofErr w:type="spellEnd"/>
-      <w:r>
-        <w:rPr>
-          <w:lang w:val="en-GB"/>
-        </w:rPr>
-        <w:t xml:space="preserve"> &gt; 1 day ) in order to see if any insights can be drawn from this?</w:t>
+        <w:t>Created a separate column that considers the ride_length and separates those that are timed out by the system ( ride_length &gt; 1 day ) in order to see if any insights can be drawn from this?</w:t>
       </w:r>
     </w:p>
     <w:p>
@@ -575,21 +333,7 @@
         <w:rPr>
           <w:lang w:val="en-GB"/>
         </w:rPr>
-        <w:t xml:space="preserve">Analysis using SQL via </w:t>
-      </w:r>
-      <w:proofErr w:type="spellStart"/>
-      <w:r>
-        <w:rPr>
-          <w:lang w:val="en-GB"/>
-        </w:rPr>
-        <w:t>Postgresql</w:t>
-      </w:r>
-      <w:proofErr w:type="spellEnd"/>
-      <w:r>
-        <w:rPr>
-          <w:lang w:val="en-GB"/>
-        </w:rPr>
-        <w:t xml:space="preserve"> in VS CODE</w:t>
+        <w:t>Analysis using SQL via Postgresql in VS CODE</w:t>
       </w:r>
     </w:p>
     <w:p>
@@ -680,21 +424,7 @@
         <w:rPr>
           <w:lang w:val="en-GB"/>
         </w:rPr>
-        <w:t xml:space="preserve">Applied queries for the questions listed </w:t>
-      </w:r>
-      <w:proofErr w:type="gramStart"/>
-      <w:r>
-        <w:rPr>
-          <w:lang w:val="en-GB"/>
-        </w:rPr>
-        <w:t>below  for</w:t>
-      </w:r>
-      <w:proofErr w:type="gramEnd"/>
-      <w:r>
-        <w:rPr>
-          <w:lang w:val="en-GB"/>
-        </w:rPr>
-        <w:t xml:space="preserve"> casual and member riders filtering out erroneous data (rides &lt; 1 minute long and greater than 1 day )</w:t>
+        <w:t>Applied queries for the questions listed below  for casual and member riders filtering out erroneous data (rides &lt; 1 minute long and greater than 1 day )</w:t>
       </w:r>
     </w:p>
     <w:p>
@@ -710,42 +440,25 @@
           <w:u w:val="single"/>
           <w:lang w:val="en-GB"/>
         </w:rPr>
-        <w:t xml:space="preserve">What are we </w:t>
-      </w:r>
-      <w:proofErr w:type="gramStart"/>
-      <w:r>
-        <w:rPr>
-          <w:u w:val="single"/>
-          <w:lang w:val="en-GB"/>
-        </w:rPr>
-        <w:t>analysing</w:t>
-      </w:r>
-      <w:proofErr w:type="gramEnd"/>
-    </w:p>
-    <w:p>
-      <w:pPr>
-        <w:pStyle w:val="ListParagraph"/>
-        <w:numPr>
-          <w:ilvl w:val="0"/>
-          <w:numId w:val="3"/>
-        </w:numPr>
-        <w:rPr>
-          <w:lang w:val="en-GB"/>
-        </w:rPr>
-      </w:pPr>
-      <w:proofErr w:type="spellStart"/>
-      <w:r>
-        <w:rPr>
-          <w:lang w:val="en-GB"/>
-        </w:rPr>
-        <w:t>Avg</w:t>
-      </w:r>
-      <w:proofErr w:type="spellEnd"/>
-      <w:r>
-        <w:rPr>
-          <w:lang w:val="en-GB"/>
-        </w:rPr>
-        <w:t xml:space="preserve"> Ride length between casual riders and annual members</w:t>
+        <w:t>Main Points of analysis</w:t>
+      </w:r>
+    </w:p>
+    <w:p>
+      <w:pPr>
+        <w:pStyle w:val="ListParagraph"/>
+        <w:numPr>
+          <w:ilvl w:val="0"/>
+          <w:numId w:val="3"/>
+        </w:numPr>
+        <w:rPr>
+          <w:lang w:val="en-GB"/>
+        </w:rPr>
+      </w:pPr>
+      <w:r>
+        <w:rPr>
+          <w:lang w:val="en-GB"/>
+        </w:rPr>
+        <w:t>Avg Ride length between casual riders and annual members</w:t>
       </w:r>
     </w:p>
     <w:p>
@@ -781,47 +494,25 @@
         <w:rPr>
           <w:lang w:val="en-GB"/>
         </w:rPr>
-        <w:t xml:space="preserve">Count of number of rides for users by </w:t>
-      </w:r>
-      <w:proofErr w:type="spellStart"/>
-      <w:r>
-        <w:rPr>
-          <w:lang w:val="en-GB"/>
-        </w:rPr>
-        <w:t>day_of_week</w:t>
-      </w:r>
-      <w:proofErr w:type="spellEnd"/>
-      <w:r>
-        <w:rPr>
-          <w:lang w:val="en-GB"/>
-        </w:rPr>
-        <w:t xml:space="preserve"> </w:t>
-      </w:r>
-    </w:p>
-    <w:p>
-      <w:pPr>
-        <w:pStyle w:val="ListParagraph"/>
-        <w:numPr>
-          <w:ilvl w:val="0"/>
-          <w:numId w:val="3"/>
-        </w:numPr>
-        <w:rPr>
-          <w:lang w:val="en-GB"/>
-        </w:rPr>
-      </w:pPr>
-      <w:proofErr w:type="spellStart"/>
-      <w:r>
-        <w:rPr>
-          <w:lang w:val="en-GB"/>
-        </w:rPr>
-        <w:t>Avg</w:t>
-      </w:r>
-      <w:proofErr w:type="spellEnd"/>
-      <w:r>
-        <w:rPr>
-          <w:lang w:val="en-GB"/>
-        </w:rPr>
-        <w:t xml:space="preserve"> ride length by day of week </w:t>
+        <w:t xml:space="preserve">Count of number of rides for users by day_of_week </w:t>
+      </w:r>
+    </w:p>
+    <w:p>
+      <w:pPr>
+        <w:pStyle w:val="ListParagraph"/>
+        <w:numPr>
+          <w:ilvl w:val="0"/>
+          <w:numId w:val="3"/>
+        </w:numPr>
+        <w:rPr>
+          <w:lang w:val="en-GB"/>
+        </w:rPr>
+      </w:pPr>
+      <w:r>
+        <w:rPr>
+          <w:lang w:val="en-GB"/>
+        </w:rPr>
+        <w:t xml:space="preserve">Avg ride length by day of week </w:t>
       </w:r>
     </w:p>
     <w:p>
@@ -993,24 +684,13 @@
         </w:rPr>
       </w:pPr>
       <w:r>
-        <w:t xml:space="preserve">To maintain system performance, I utilized PostgreSQL to perform data reduction, isolating only the 'system error' records (rides &lt; 1 </w:t>
-      </w:r>
-      <w:proofErr w:type="gramStart"/>
-      <w:r>
-        <w:t>minute</w:t>
+        <w:t>To maintain system performance, I utilized PostgreSQL to perform data reduction, isolating only the 'system error' records (rides &lt; 1 minute</w:t>
       </w:r>
       <w:r>
         <w:rPr>
           <w:lang w:val="en-001"/>
         </w:rPr>
-        <w:t xml:space="preserve"> ,</w:t>
-      </w:r>
-      <w:proofErr w:type="gramEnd"/>
-      <w:r>
-        <w:rPr>
-          <w:lang w:val="en-001"/>
-        </w:rPr>
-        <w:t xml:space="preserve"> as well as those with ride length greater than 1 day</w:t>
+        <w:t xml:space="preserve"> , as well as those with ride length greater than 1 day</w:t>
       </w:r>
       <w:r>
         <w:t>). I then piped this subset into Python to conduct a root-cause analysis on hardware malfunctions.</w:t>
@@ -1028,16 +708,212 @@
         </w:rPr>
         <w:t>Using python to conduct a deep dive into the data to find out the connection to the hardware anomalies and the bike rider’s behaviour, as well as statistical distribution</w:t>
       </w:r>
-    </w:p>
-    <w:p>
-      <w:pPr>
-        <w:rPr>
-          <w:lang w:val="en-GB"/>
-        </w:rPr>
-      </w:pPr>
-    </w:p>
-    <w:p>
-      <w:pPr>
+      <w:r>
+        <w:rPr>
+          <w:lang w:val="en-GB"/>
+        </w:rPr>
+        <w:t>.</w:t>
+      </w:r>
+    </w:p>
+    <w:p>
+      <w:pPr>
+        <w:rPr>
+          <w:u w:val="single"/>
+          <w:lang w:val="en-GB"/>
+        </w:rPr>
+      </w:pPr>
+      <w:r>
+        <w:rPr>
+          <w:u w:val="single"/>
+          <w:lang w:val="en-GB"/>
+        </w:rPr>
+        <w:t>Main points of analysis in Python</w:t>
+      </w:r>
+    </w:p>
+    <w:p>
+      <w:pPr>
+        <w:rPr>
+          <w:lang w:val="en-GB"/>
+        </w:rPr>
+      </w:pPr>
+    </w:p>
+    <w:p>
+      <w:pPr>
+        <w:pStyle w:val="ListParagraph"/>
+        <w:numPr>
+          <w:ilvl w:val="0"/>
+          <w:numId w:val="3"/>
+        </w:numPr>
+        <w:rPr>
+          <w:lang w:val="en-GB"/>
+        </w:rPr>
+      </w:pPr>
+      <w:r>
+        <w:rPr>
+          <w:lang w:val="en-GB"/>
+        </w:rPr>
+        <w:t xml:space="preserve">Analysis of </w:t>
+      </w:r>
+      <w:r>
+        <w:rPr>
+          <w:lang w:val="en-GB"/>
+        </w:rPr>
+        <w:t xml:space="preserve">bikes with system timeout </w:t>
+      </w:r>
+      <w:r>
+        <w:rPr>
+          <w:lang w:val="en-GB"/>
+        </w:rPr>
+        <w:t>, ride length &gt; 1440 mins or 24 hours.</w:t>
+      </w:r>
+    </w:p>
+    <w:p>
+      <w:pPr>
+        <w:pStyle w:val="ListParagraph"/>
+        <w:numPr>
+          <w:ilvl w:val="0"/>
+          <w:numId w:val="3"/>
+        </w:numPr>
+        <w:rPr>
+          <w:lang w:val="en-GB"/>
+        </w:rPr>
+      </w:pPr>
+      <w:r>
+        <w:rPr>
+          <w:lang w:val="en-GB"/>
+        </w:rPr>
+        <w:t xml:space="preserve">Looking at </w:t>
+      </w:r>
+      <w:r>
+        <w:rPr>
+          <w:lang w:val="en-GB"/>
+        </w:rPr>
+        <w:t>bikes with less than 1 min rides indicating unlocking error or system error</w:t>
+      </w:r>
+      <w:r>
+        <w:rPr>
+          <w:lang w:val="en-GB"/>
+        </w:rPr>
+        <w:t>.</w:t>
+      </w:r>
+    </w:p>
+    <w:p>
+      <w:pPr>
+        <w:pStyle w:val="ListParagraph"/>
+        <w:numPr>
+          <w:ilvl w:val="0"/>
+          <w:numId w:val="3"/>
+        </w:numPr>
+        <w:rPr>
+          <w:lang w:val="en-GB"/>
+        </w:rPr>
+      </w:pPr>
+      <w:r>
+        <w:rPr>
+          <w:lang w:val="en-GB"/>
+        </w:rPr>
+        <w:t>analysing bikes than have ride time in the negatives (&lt;0) indicating that they were affected by DST.</w:t>
+      </w:r>
+    </w:p>
+    <w:p>
+      <w:pPr>
+        <w:pStyle w:val="Heading1"/>
+        <w:rPr>
+          <w:lang w:val="en-GB"/>
+        </w:rPr>
+      </w:pPr>
+      <w:r>
+        <w:rPr>
+          <w:lang w:val="en-GB"/>
+        </w:rPr>
+        <w:t>Visualizations with Tableau and Python</w:t>
+      </w:r>
+    </w:p>
+    <w:p>
+      <w:pPr>
+        <w:pStyle w:val="ListParagraph"/>
+        <w:numPr>
+          <w:ilvl w:val="0"/>
+          <w:numId w:val="3"/>
+        </w:numPr>
+        <w:rPr>
+          <w:lang w:val="en-GB"/>
+        </w:rPr>
+      </w:pPr>
+      <w:r>
+        <w:rPr>
+          <w:lang w:val="en-GB"/>
+        </w:rPr>
+        <w:t>Visualizations for the first analysis performed in SQL were done using Tableau.</w:t>
+      </w:r>
+    </w:p>
+    <w:p>
+      <w:pPr>
+        <w:pStyle w:val="ListParagraph"/>
+        <w:numPr>
+          <w:ilvl w:val="0"/>
+          <w:numId w:val="3"/>
+        </w:numPr>
+        <w:rPr>
+          <w:lang w:val="en-GB"/>
+        </w:rPr>
+      </w:pPr>
+      <w:r>
+        <w:rPr>
+          <w:lang w:val="en-GB"/>
+        </w:rPr>
+        <w:t>Visualizations for the erroneous data in Python were done in the Python Jupyter Notebook</w:t>
+      </w:r>
+    </w:p>
+    <w:p>
+      <w:pPr>
+        <w:rPr>
+          <w:lang w:val="en-GB"/>
+        </w:rPr>
+      </w:pPr>
+    </w:p>
+    <w:p>
+      <w:pPr>
+        <w:rPr>
+          <w:lang w:val="en-GB"/>
+        </w:rPr>
+      </w:pPr>
+    </w:p>
+    <w:p>
+      <w:pPr>
+        <w:pStyle w:val="Heading1"/>
+        <w:rPr>
+          <w:lang w:val="en-GB"/>
+        </w:rPr>
+      </w:pPr>
+      <w:r>
+        <w:rPr>
+          <w:lang w:val="en-GB"/>
+        </w:rPr>
+        <w:t>Sharing of findings with Powerpoint, Word report</w:t>
+      </w:r>
+    </w:p>
+    <w:p>
+      <w:pPr>
+        <w:pStyle w:val="ListParagraph"/>
+        <w:numPr>
+          <w:ilvl w:val="0"/>
+          <w:numId w:val="3"/>
+        </w:numPr>
+        <w:rPr>
+          <w:lang w:val="en-GB"/>
+        </w:rPr>
+      </w:pPr>
+      <w:r>
+        <w:rPr>
+          <w:lang w:val="en-GB"/>
+        </w:rPr>
+        <w:t>For the share phase of the project, I chose to use powerpoint, a business report write up and a dashboard story on Tableau.</w:t>
+      </w:r>
+    </w:p>
+    <w:p>
+      <w:pPr>
+        <w:pStyle w:val="Heading2"/>
         <w:rPr>
           <w:lang w:val="en-GB"/>
         </w:rPr>
@@ -1846,6 +1722,28 @@
       <w:szCs w:val="32"/>
     </w:rPr>
   </w:style>
+  <w:style w:type="paragraph" w:styleId="Heading2">
+    <w:name w:val="heading 2"/>
+    <w:basedOn w:val="Normal"/>
+    <w:next w:val="Normal"/>
+    <w:link w:val="Heading2Char"/>
+    <w:uiPriority w:val="9"/>
+    <w:unhideWhenUsed/>
+    <w:qFormat/>
+    <w:rsid w:val="00516990"/>
+    <w:pPr>
+      <w:keepNext/>
+      <w:keepLines/>
+      <w:spacing w:before="40" w:after="0"/>
+      <w:outlineLvl w:val="1"/>
+    </w:pPr>
+    <w:rPr>
+      <w:rFonts w:asciiTheme="majorHAnsi" w:eastAsiaTheme="majorEastAsia" w:hAnsiTheme="majorHAnsi" w:cstheme="majorBidi"/>
+      <w:color w:val="2F5496" w:themeColor="accent1" w:themeShade="BF"/>
+      <w:sz w:val="26"/>
+      <w:szCs w:val="26"/>
+    </w:rPr>
+  </w:style>
   <w:style w:type="character" w:default="1" w:styleId="DefaultParagraphFont">
     <w:name w:val="Default Paragraph Font"/>
     <w:uiPriority w:val="1"/>
@@ -1895,6 +1793,19 @@
       <w:color w:val="2F5496" w:themeColor="accent1" w:themeShade="BF"/>
       <w:sz w:val="32"/>
       <w:szCs w:val="32"/>
+    </w:rPr>
+  </w:style>
+  <w:style w:type="character" w:customStyle="1" w:styleId="Heading2Char">
+    <w:name w:val="Heading 2 Char"/>
+    <w:basedOn w:val="DefaultParagraphFont"/>
+    <w:link w:val="Heading2"/>
+    <w:uiPriority w:val="9"/>
+    <w:rsid w:val="00516990"/>
+    <w:rPr>
+      <w:rFonts w:asciiTheme="majorHAnsi" w:eastAsiaTheme="majorEastAsia" w:hAnsiTheme="majorHAnsi" w:cstheme="majorBidi"/>
+      <w:color w:val="2F5496" w:themeColor="accent1" w:themeShade="BF"/>
+      <w:sz w:val="26"/>
+      <w:szCs w:val="26"/>
     </w:rPr>
   </w:style>
 </w:styles>

</xml_diff>